<commit_message>
Reformat what_changed_txt.docx as plain text, not a styled doc
Co-Authored-By: Claude Sonnet 5 <noreply@anthropic.com>
</commit_message>
<xml_diff>
--- a/document/what_changed_txt.docx
+++ b/document/what_changed_txt.docx
@@ -3,663 +3,256 @@
 <w:document xmlns:wpc="http://schemas.microsoft.com/office/word/2010/wordprocessingCanvas" xmlns:mo="http://schemas.microsoft.com/office/mac/office/2008/main" xmlns:mc="http://schemas.openxmlformats.org/markup-compatibility/2006" xmlns:mv="urn:schemas-microsoft-com:mac:vml" xmlns:o="urn:schemas-microsoft-com:office:office" xmlns:r="http://schemas.openxmlformats.org/officeDocument/2006/relationships" xmlns:m="http://schemas.openxmlformats.org/officeDocument/2006/math" xmlns:v="urn:schemas-microsoft-com:vml" xmlns:wp14="http://schemas.microsoft.com/office/word/2010/wordprocessingDrawing" xmlns:wp="http://schemas.openxmlformats.org/drawingml/2006/wordprocessingDrawing" xmlns:w10="urn:schemas-microsoft-com:office:word" xmlns:w="http://schemas.openxmlformats.org/wordprocessingml/2006/main" xmlns:w14="http://schemas.microsoft.com/office/word/2010/wordml" xmlns:wpg="http://schemas.microsoft.com/office/word/2010/wordprocessingGroup" xmlns:wpi="http://schemas.microsoft.com/office/word/2010/wordprocessingInk" xmlns:wne="http://schemas.microsoft.com/office/word/2006/wordml" xmlns:wps="http://schemas.microsoft.com/office/word/2010/wordprocessingShape" mc:Ignorable="w14 wp14">
   <w:body>
     <w:p>
-      <w:pPr>
-        <w:pStyle w:val="Heading1"/>
-      </w:pPr>
       <w:r>
-        <w:t>What changed</w:t>
+        <w:t>## What changed</w:t>
       </w:r>
     </w:p>
+    <w:p/>
     <w:p>
       <w:r>
         <w:t>Every claim below was verified by running the code, not by reading it.</w:t>
       </w:r>
     </w:p>
+    <w:p/>
     <w:p>
-      <w:pPr>
-        <w:pStyle w:val="Heading2"/>
-      </w:pPr>
       <w:r>
-        <w:t>Dependency graph</w:t>
+        <w:t>### Dependency graph</w:t>
       </w:r>
     </w:p>
+    <w:p/>
     <w:p>
       <w:r>
         <w:t>Before, importing any BatteryML trainer pulled in the entire MIT pipeline:</w:t>
       </w:r>
     </w:p>
+    <w:p/>
     <w:p>
-      <w:pPr>
-        <w:spacing w:before="120" w:after="240"/>
-      </w:pPr>
       <w:r>
-        <w:rPr>
-          <w:rFonts w:ascii="Consolas" w:hAnsi="Consolas"/>
-          <w:sz w:val="18"/>
-        </w:rPr>
         <w:t>train_clf_bml -&gt; train_clf -&gt; dataset_clf -&gt; gen_features -&gt; h5py</w:t>
       </w:r>
     </w:p>
+    <w:p/>
     <w:p>
       <w:r>
         <w:t>train_clf.py mixed two jobs in one file: the shared model definitions (lines 29-170) and its own MIT-dataset CLI. Python cannot import half a file, so borrowing the model meant loading the dataset layer of a corpus you were not using. The shared half is now model_clf.py, which imports nothing but torch and numpy.</w:t>
       </w:r>
     </w:p>
+    <w:p/>
     <w:p>
-      <w:pPr>
-        <w:spacing w:before="120" w:after="240"/>
-      </w:pPr>
       <w:r>
-        <w:rPr>
-          <w:rFonts w:ascii="Consolas" w:hAnsi="Consolas"/>
-          <w:sz w:val="18"/>
-        </w:rPr>
         <w:t>train_clf_bml_V2      -&gt; model_clf, dataset_clf_bml_v2   (no MIT modules)</w:t>
       </w:r>
+    </w:p>
+    <w:p>
       <w:r>
-        <w:br/>
-      </w:r>
-      <w:r>
-        <w:rPr>
-          <w:rFonts w:ascii="Consolas" w:hAnsi="Consolas"/>
-          <w:sz w:val="18"/>
-        </w:rPr>
         <w:t>train_clf_es_bml_V2   -&gt; model_clf, dataset_clf_bml_v2</w:t>
       </w:r>
+    </w:p>
+    <w:p>
       <w:r>
-        <w:br/>
-      </w:r>
-      <w:r>
-        <w:rPr>
-          <w:rFonts w:ascii="Consolas" w:hAnsi="Consolas"/>
-          <w:sz w:val="18"/>
-        </w:rPr>
         <w:t>train_clf_bml_tf_V2   -&gt; dataset_clf_bml_v2              (model inlined)</w:t>
       </w:r>
+    </w:p>
+    <w:p>
       <w:r>
-        <w:br/>
-      </w:r>
-      <w:r>
-        <w:rPr>
-          <w:rFonts w:ascii="Consolas" w:hAnsi="Consolas"/>
-          <w:sz w:val="18"/>
-        </w:rPr>
         <w:t>dataset_clf_bml_v2    -&gt; gen_feature_bml_v2</w:t>
       </w:r>
+    </w:p>
+    <w:p>
       <w:r>
-        <w:br/>
-      </w:r>
-      <w:r>
-        <w:rPr>
-          <w:rFonts w:ascii="Consolas" w:hAnsi="Consolas"/>
-          <w:sz w:val="18"/>
-        </w:rPr>
         <w:t>model_clf             -&gt; (nothing)</w:t>
       </w:r>
     </w:p>
+    <w:p/>
     <w:p>
       <w:r>
         <w:t>Repository went from 20 files to 7.</w:t>
       </w:r>
     </w:p>
+    <w:p/>
     <w:p>
-      <w:pPr>
-        <w:pStyle w:val="Heading2"/>
-      </w:pPr>
       <w:r>
-        <w:t>Bugs fixed</w:t>
+        <w:t>### Bugs fixed</w:t>
+      </w:r>
+    </w:p>
+    <w:p/>
+    <w:p>
+      <w:r>
+        <w:t>Feature export / dataset</w:t>
+      </w:r>
+    </w:p>
+    <w:p/>
+    <w:p>
+      <w:r>
+        <w:t>| Bug | Effect |</w:t>
       </w:r>
     </w:p>
     <w:p>
-      <w:pPr>
-        <w:spacing w:before="200" w:after="80"/>
-      </w:pPr>
       <w:r>
-        <w:rPr>
-          <w:b/>
-        </w:rPr>
-        <w:t>Feature export / dataset</w:t>
+        <w:t>|---|---|</w:t>
       </w:r>
     </w:p>
-    <w:tbl>
-      <w:tblPr>
-        <w:tblStyle w:val="LightGrid-Accent1"/>
-        <w:tblW w:type="auto" w:w="0"/>
-        <w:tblLook w:firstColumn="1" w:firstRow="1" w:lastColumn="0" w:lastRow="0" w:noHBand="0" w:noVBand="1" w:val="04A0"/>
-      </w:tblPr>
-      <w:tblGrid>
-        <w:gridCol w:w="4320"/>
-        <w:gridCol w:w="4320"/>
-      </w:tblGrid>
-      <w:tr>
-        <w:tc>
-          <w:tcPr>
-            <w:tcW w:type="dxa" w:w="4320"/>
-          </w:tcPr>
-          <w:p>
-            <w:r>
-              <w:rPr>
-                <w:b/>
-              </w:rPr>
-              <w:t>Bug</w:t>
-            </w:r>
-          </w:p>
-        </w:tc>
-        <w:tc>
-          <w:tcPr>
-            <w:tcW w:type="dxa" w:w="4320"/>
-          </w:tcPr>
-          <w:p>
-            <w:r>
-              <w:rPr>
-                <w:b/>
-              </w:rPr>
-              <w:t>Effect</w:t>
-            </w:r>
-          </w:p>
-        </w:tc>
-      </w:tr>
-      <w:tr>
-        <w:tc>
-          <w:tcPr>
-            <w:tcW w:type="dxa" w:w="4320"/>
-          </w:tcPr>
-          <w:p>
-            <w:r>
-              <w:t>"Qc": qd — charge capacity keyed to the discharge array</w:t>
-            </w:r>
-          </w:p>
-        </w:tc>
-        <w:tc>
-          <w:tcPr>
-            <w:tcW w:type="dxa" w:w="4320"/>
-          </w:tcPr>
-          <w:p>
-            <w:r>
-              <w:t>Silent duplicate of Qd the moment Qc is enabled</w:t>
-            </w:r>
-          </w:p>
-        </w:tc>
-      </w:tr>
-      <w:tr>
-        <w:tc>
-          <w:tcPr>
-            <w:tcW w:type="dxa" w:w="4320"/>
-          </w:tcPr>
-          <w:p>
-            <w:r>
-              <w:t>Loader re-ran its own EOL search over already-truncated arrays</w:t>
-            </w:r>
-          </w:p>
-        </w:tc>
-        <w:tc>
-          <w:tcPr>
-            <w:tcW w:type="dxa" w:w="4320"/>
-          </w:tcPr>
-          <w:p>
-            <w:r>
-              <w:t>Undid the exporter's confirmation-window rule on 4/169 MATR cells, one by up to 113 cycles</w:t>
-            </w:r>
-          </w:p>
-        </w:tc>
-      </w:tr>
-      <w:tr>
-        <w:tc>
-          <w:tcPr>
-            <w:tcW w:type="dxa" w:w="4320"/>
-          </w:tcPr>
-          <w:p>
-            <w:r>
-              <w:t>Missing .npz key returned an empty array</w:t>
-            </w:r>
-          </w:p>
-        </w:tc>
-        <w:tc>
-          <w:tcPr>
-            <w:tcW w:type="dxa" w:w="4320"/>
-          </w:tcPr>
-          <w:p>
-            <w:r>
-              <w:t>Feature column became a constant zero; training ran, accuracy silently dropped</w:t>
-            </w:r>
-          </w:p>
-        </w:tc>
-      </w:tr>
-      <w:tr>
-        <w:tc>
-          <w:tcPr>
-            <w:tcW w:type="dxa" w:w="4320"/>
-          </w:tcPr>
-          <w:p>
-            <w:r>
-              <w:t>dqdv loaded but never read</w:t>
-            </w:r>
-          </w:p>
-        </w:tc>
-        <w:tc>
-          <w:tcPr>
-            <w:tcW w:type="dxa" w:w="4320"/>
-          </w:tcPr>
-          <w:p>
-            <w:r>
-              <w:t>194 MB of resident memory across 64 cells</w:t>
-            </w:r>
-          </w:p>
-        </w:tc>
-      </w:tr>
-      <w:tr>
-        <w:tc>
-          <w:tcPr>
-            <w:tcW w:type="dxa" w:w="4320"/>
-          </w:tcPr>
-          <w:p>
-            <w:r>
-              <w:t>Scaler fitted on one concatenated block</w:t>
-            </w:r>
-          </w:p>
-        </w:tc>
-        <w:tc>
-          <w:tcPr>
-            <w:tcW w:type="dxa" w:w="4320"/>
-          </w:tcPr>
-          <w:p>
-            <w:r>
-              <w:t>2.56 GB peak; partial_fit in chunks peaks at 32 MB with bit-identical transform output</w:t>
-            </w:r>
-          </w:p>
-        </w:tc>
-      </w:tr>
-    </w:tbl>
+    <w:p>
+      <w:r>
+        <w:t>| "Qc": qd - charge capacity keyed to the discharge array | Silent duplicate of Qd the moment Qc is enabled |</w:t>
+      </w:r>
+    </w:p>
+    <w:p>
+      <w:r>
+        <w:t>| Loader re-ran its own EOL search over already-truncated arrays | Undid the exporter's confirmation-window rule on 4/169 MATR cells, one by up to 113 cycles |</w:t>
+      </w:r>
+    </w:p>
+    <w:p>
+      <w:r>
+        <w:t>| Missing .npz key returned an empty array | Feature column became a constant zero; training ran, accuracy silently dropped |</w:t>
+      </w:r>
+    </w:p>
+    <w:p>
+      <w:r>
+        <w:t>| dqdv loaded but never read | 194 MB of resident memory across 64 cells |</w:t>
+      </w:r>
+    </w:p>
+    <w:p>
+      <w:r>
+        <w:t>| Scaler fitted on one concatenated block | 2.56 GB peak; partial_fit in chunks peaks at 32 MB with bit-identical transform output |</w:t>
+      </w:r>
+    </w:p>
     <w:p/>
     <w:p>
-      <w:pPr>
-        <w:spacing w:before="200" w:after="80"/>
-      </w:pPr>
       <w:r>
-        <w:rPr>
-          <w:b/>
-        </w:rPr>
         <w:t>Sparse CMA-ES trainer</w:t>
       </w:r>
     </w:p>
-    <w:tbl>
-      <w:tblPr>
-        <w:tblStyle w:val="LightGrid-Accent1"/>
-        <w:tblW w:type="auto" w:w="0"/>
-        <w:tblLook w:firstColumn="1" w:firstRow="1" w:lastColumn="0" w:lastRow="0" w:noHBand="0" w:noVBand="1" w:val="04A0"/>
-      </w:tblPr>
-      <w:tblGrid>
-        <w:gridCol w:w="4320"/>
-        <w:gridCol w:w="4320"/>
-      </w:tblGrid>
-      <w:tr>
-        <w:tc>
-          <w:tcPr>
-            <w:tcW w:type="dxa" w:w="4320"/>
-          </w:tcPr>
-          <w:p>
-            <w:r>
-              <w:rPr>
-                <w:b/>
-              </w:rPr>
-              <w:t>Bug</w:t>
-            </w:r>
-          </w:p>
-        </w:tc>
-        <w:tc>
-          <w:tcPr>
-            <w:tcW w:type="dxa" w:w="4320"/>
-          </w:tcPr>
-          <w:p>
-            <w:r>
-              <w:rPr>
-                <w:b/>
-              </w:rPr>
-              <w:t>Effect</w:t>
-            </w:r>
-          </w:p>
-        </w:tc>
-      </w:tr>
-      <w:tr>
-        <w:tc>
-          <w:tcPr>
-            <w:tcW w:type="dxa" w:w="4320"/>
-          </w:tcPr>
-          <w:p>
-            <w:r>
-              <w:t>mask = abs(w) &lt;= threshold under a comment reading keep LARGE weights</w:t>
-            </w:r>
-          </w:p>
-        </w:tc>
-        <w:tc>
-          <w:tcPr>
-            <w:tcW w:type="dxa" w:w="4320"/>
-          </w:tcPr>
-          <w:p>
-            <w:r>
-              <w:t>Evolved the smallest weights — the exact opposite of the design</w:t>
-            </w:r>
-          </w:p>
-        </w:tc>
-      </w:tr>
-      <w:tr>
-        <w:tc>
-          <w:tcPr>
-            <w:tcW w:type="dxa" w:w="4320"/>
-          </w:tcPr>
-          <w:p>
-            <w:r>
-              <w:t>_ES_MODULES listed all five submodules</w:t>
-            </w:r>
-          </w:p>
-        </w:tc>
-        <w:tc>
-          <w:tcPr>
-            <w:tcW w:type="dxa" w:w="4320"/>
-          </w:tcPr>
-          <w:p>
-            <w:r>
-              <w:t>34/34 parameter tensors were maskable, so nothing was frozen despite the docstring</w:t>
-            </w:r>
-          </w:p>
-        </w:tc>
-      </w:tr>
-      <w:tr>
-        <w:tc>
-          <w:tcPr>
-            <w:tcW w:type="dxa" w:w="4320"/>
-          </w:tcPr>
-          <w:p>
-            <w:r>
-              <w:t>train_loader=val_loader, val_loader=train_loader at the call site</w:t>
-            </w:r>
-          </w:p>
-        </w:tc>
-        <w:tc>
-          <w:tcPr>
-            <w:tcW w:type="dxa" w:w="4320"/>
-          </w:tcPr>
-          <w:p>
-            <w:r>
-              <w:t>Fitness was measured on the training split</w:t>
-            </w:r>
-          </w:p>
-        </w:tc>
-      </w:tr>
-      <w:tr>
-        <w:tc>
-          <w:tcPr>
-            <w:tcW w:type="dxa" w:w="4320"/>
-          </w:tcPr>
-          <w:p>
-            <w:r>
-              <w:t>cnn_dim reconstructed as head[0].in_features // 2</w:t>
-            </w:r>
-          </w:p>
-        </w:tc>
-        <w:tc>
-          <w:tcPr>
-            <w:tcW w:type="dxa" w:w="4320"/>
-          </w:tcPr>
-          <w:p>
-            <w:r>
-              <w:t>Equals gru_dim, not cnn_dim; every worker crashed once the two differed</w:t>
-            </w:r>
-          </w:p>
-        </w:tc>
-      </w:tr>
-      <w:tr>
-        <w:tc>
-          <w:tcPr>
-            <w:tcW w:type="dxa" w:w="4320"/>
-          </w:tcPr>
-          <w:p>
-            <w:r>
-              <w:t>except Exception: put((rank, 0.0)) with no logging</w:t>
-            </w:r>
-          </w:p>
-        </w:tc>
-        <w:tc>
-          <w:tcPr>
-            <w:tcW w:type="dxa" w:w="4320"/>
-          </w:tcPr>
-          <w:p>
-            <w:r>
-              <w:t>Worker crashes were indistinguishable from genuinely bad offspring</w:t>
-            </w:r>
-          </w:p>
-        </w:tc>
-      </w:tr>
-      <w:tr>
-        <w:tc>
-          <w:tcPr>
-            <w:tcW w:type="dxa" w:w="4320"/>
-          </w:tcPr>
-          <w:p>
-            <w:r>
-              <w:t>best_acc assigned once before the loop, then returned</w:t>
-            </w:r>
-          </w:p>
-        </w:tc>
-        <w:tc>
-          <w:tcPr>
-            <w:tcW w:type="dxa" w:w="4320"/>
-          </w:tcPr>
-          <w:p>
-            <w:r>
-              <w:t>Early-stop gate and return value both frozen at the pre-search value</w:t>
-            </w:r>
-          </w:p>
-        </w:tc>
-      </w:tr>
-    </w:tbl>
     <w:p/>
     <w:p>
-      <w:pPr>
-        <w:spacing w:before="200" w:after="80"/>
-      </w:pPr>
       <w:r>
-        <w:rPr>
-          <w:b/>
-        </w:rPr>
+        <w:t>| Bug | Effect |</w:t>
+      </w:r>
+    </w:p>
+    <w:p>
+      <w:r>
+        <w:t>|---|---|</w:t>
+      </w:r>
+    </w:p>
+    <w:p>
+      <w:r>
+        <w:t>| mask = abs(w) &lt;= threshold under a comment reading keep LARGE weights | Evolved the smallest weights - the exact opposite of the design |</w:t>
+      </w:r>
+    </w:p>
+    <w:p>
+      <w:r>
+        <w:t>| _ES_MODULES listed all five submodules | 34/34 parameter tensors were maskable, so nothing was frozen despite the docstring |</w:t>
+      </w:r>
+    </w:p>
+    <w:p>
+      <w:r>
+        <w:t>| train_loader=val_loader, val_loader=train_loader at the call site | Fitness was measured on the training split |</w:t>
+      </w:r>
+    </w:p>
+    <w:p>
+      <w:r>
+        <w:t>| cnn_dim reconstructed as head[0].in_features // 2 | Equals gru_dim, not cnn_dim; every worker crashed once the two differed |</w:t>
+      </w:r>
+    </w:p>
+    <w:p>
+      <w:r>
+        <w:t>| except Exception: put((rank, 0.0)) with no logging | Worker crashes were indistinguishable from genuinely bad offspring |</w:t>
+      </w:r>
+    </w:p>
+    <w:p>
+      <w:r>
+        <w:t>| best_acc assigned once before the loop, then returned | Early-stop gate and return value both frozen at the pre-search value |</w:t>
+      </w:r>
+    </w:p>
+    <w:p/>
+    <w:p>
+      <w:r>
         <w:t>Transformer trainer</w:t>
       </w:r>
     </w:p>
-    <w:tbl>
-      <w:tblPr>
-        <w:tblStyle w:val="LightGrid-Accent1"/>
-        <w:tblW w:type="auto" w:w="0"/>
-        <w:tblLook w:firstColumn="1" w:firstRow="1" w:lastColumn="0" w:lastRow="0" w:noHBand="0" w:noVBand="1" w:val="04A0"/>
-      </w:tblPr>
-      <w:tblGrid>
-        <w:gridCol w:w="4320"/>
-        <w:gridCol w:w="4320"/>
-      </w:tblGrid>
-      <w:tr>
-        <w:tc>
-          <w:tcPr>
-            <w:tcW w:type="dxa" w:w="4320"/>
-          </w:tcPr>
-          <w:p>
-            <w:r>
-              <w:rPr>
-                <w:b/>
-              </w:rPr>
-              <w:t>Bug</w:t>
-            </w:r>
-          </w:p>
-        </w:tc>
-        <w:tc>
-          <w:tcPr>
-            <w:tcW w:type="dxa" w:w="4320"/>
-          </w:tcPr>
-          <w:p>
-            <w:r>
-              <w:rPr>
-                <w:b/>
-              </w:rPr>
-              <w:t>Effect</w:t>
-            </w:r>
-          </w:p>
-        </w:tc>
-      </w:tr>
-      <w:tr>
-        <w:tc>
-          <w:tcPr>
-            <w:tcW w:type="dxa" w:w="4320"/>
-          </w:tcPr>
-          <w:p>
-            <w:r>
-              <w:t>_build_pos_enc defined, never called in forward</w:t>
-            </w:r>
-          </w:p>
-        </w:tc>
-        <w:tc>
-          <w:tcPr>
-            <w:tcW w:type="dxa" w:w="4320"/>
-          </w:tcPr>
-          <w:p>
-            <w:r>
-              <w:t>f(x) and f(reversed x) matched to 0.000000 — the window was an unordered bag</w:t>
-            </w:r>
-          </w:p>
-        </w:tc>
-      </w:tr>
-      <w:tr>
-        <w:tc>
-          <w:tcPr>
-            <w:tcW w:type="dxa" w:w="4320"/>
-          </w:tcPr>
-          <w:p>
-            <w:r>
-              <w:t>classification_report without labels=</w:t>
-            </w:r>
-          </w:p>
-        </w:tc>
-        <w:tc>
-          <w:tcPr>
-            <w:tcW w:type="dxa" w:w="4320"/>
-          </w:tcPr>
-          <w:p>
-            <w:r>
-              <w:t>ValueError whenever the test split lacked a class</w:t>
-            </w:r>
-          </w:p>
-        </w:tc>
-      </w:tr>
-      <w:tr>
-        <w:tc>
-          <w:tcPr>
-            <w:tcW w:type="dxa" w:w="4320"/>
-          </w:tcPr>
-          <w:p>
-            <w:r>
-              <w:t>No seeding anywhere</w:t>
-            </w:r>
-          </w:p>
-        </w:tc>
-        <w:tc>
-          <w:tcPr>
-            <w:tcW w:type="dxa" w:w="4320"/>
-          </w:tcPr>
-          <w:p>
-            <w:r>
-              <w:t>Two runs of the same command produced different models</w:t>
-            </w:r>
-          </w:p>
-        </w:tc>
-      </w:tr>
-    </w:tbl>
     <w:p/>
     <w:p>
-      <w:pPr>
-        <w:spacing w:before="200" w:after="80"/>
-      </w:pPr>
       <w:r>
-        <w:rPr>
-          <w:b/>
-        </w:rPr>
+        <w:t>| Bug | Effect |</w:t>
+      </w:r>
+    </w:p>
+    <w:p>
+      <w:r>
+        <w:t>|---|---|</w:t>
+      </w:r>
+    </w:p>
+    <w:p>
+      <w:r>
+        <w:t>| _build_pos_enc defined, never called in forward | f(x) and f(reversed x) matched to 0.000000 - the window was an unordered bag |</w:t>
+      </w:r>
+    </w:p>
+    <w:p>
+      <w:r>
+        <w:t>| classification_report without labels= | ValueError whenever the test split lacked a class |</w:t>
+      </w:r>
+    </w:p>
+    <w:p>
+      <w:r>
+        <w:t>| No seeding anywhere | Two runs of the same command produced different models |</w:t>
+      </w:r>
+    </w:p>
+    <w:p/>
+    <w:p>
+      <w:r>
         <w:t>Shared across trainers</w:t>
       </w:r>
     </w:p>
+    <w:p/>
     <w:p>
-      <w:pPr>
-        <w:pStyle w:val="ListBullet"/>
-      </w:pPr>
       <w:r>
-        <w:t>ReduceLROnPlateau(verbose=True) — removed from PyTorch; the trainer crashed before the first epoch</w:t>
+        <w:t>- ReduceLROnPlateau(verbose=True) - removed from PyTorch; the trainer crashed before the first epoch</w:t>
       </w:r>
     </w:p>
     <w:p>
-      <w:pPr>
-        <w:pStyle w:val="ListBullet"/>
-      </w:pPr>
       <w:r>
-        <w:t>import cma at module level — blocked --es_mode 0, which uses no CMA-ES</w:t>
+        <w:t>- import cma at module level - blocked --es_mode 0, which uses no CMA-ES</w:t>
       </w:r>
     </w:p>
     <w:p>
-      <w:pPr>
-        <w:pStyle w:val="ListBullet"/>
-      </w:pPr>
       <w:r>
-        <w:t>torch.manual_seed without cudnn.deterministic — VaLoss still drifted (0.8858 / 0.8850 / 0.8846); pinning cuDNN makes runs match digit for digit</w:t>
+        <w:t>- torch.manual_seed without cudnn.deterministic - VaLoss still drifted (0.8858 / 0.8850 / 0.8846); pinning cuDNN makes runs match digit for digit</w:t>
       </w:r>
     </w:p>
     <w:p>
-      <w:pPr>
-        <w:pStyle w:val="ListBullet"/>
-      </w:pPr>
       <w:r>
-        <w:t>va_acc &gt;= best_val_acc — re-saved the checkpoint on ties, so stagnation never accumulated</w:t>
+        <w:t>- va_acc &gt;= best_val_acc - re-saved the checkpoint on ties, so stagnation never accumulated</w:t>
       </w:r>
     </w:p>
     <w:p>
-      <w:pPr>
-        <w:pStyle w:val="ListBullet"/>
-      </w:pPr>
       <w:r>
-        <w:t>CMA-ES branch left the model holding parameters that scored worse than the checkpoint on disk</w:t>
+        <w:t>- CMA-ES branch left the model holding parameters that scored worse than the checkpoint on disk</w:t>
+      </w:r>
+    </w:p>
+    <w:p/>
+    <w:p>
+      <w:r>
+        <w:t>### Added</w:t>
+      </w:r>
+    </w:p>
+    <w:p/>
+    <w:p>
+      <w:r>
+        <w:t>- model_config.json beside every checkpoint, so the notebook rebuilds the architecture instead of retyping it</w:t>
       </w:r>
     </w:p>
     <w:p>
-      <w:pPr>
-        <w:pStyle w:val="Heading2"/>
-      </w:pPr>
       <w:r>
-        <w:t>Added</w:t>
+        <w:t>- Info_log.txt mirroring console output (verified byte-identical)</w:t>
       </w:r>
     </w:p>
     <w:p>
-      <w:pPr>
-        <w:pStyle w:val="ListBullet"/>
-      </w:pPr>
       <w:r>
-        <w:t>model_config.json beside every checkpoint, so the notebook rebuilds the architecture instead of retyping it</w:t>
+        <w:t>- Deterministic seeding across random, numpy, torch, CUDA and cuDNN</w:t>
       </w:r>
     </w:p>
     <w:p>
-      <w:pPr>
-        <w:pStyle w:val="ListBullet"/>
-      </w:pPr>
       <w:r>
-        <w:t>Info_log.txt mirroring console output (verified byte-identical)</w:t>
-      </w:r>
-    </w:p>
-    <w:p>
-      <w:pPr>
-        <w:pStyle w:val="ListBullet"/>
-      </w:pPr>
-      <w:r>
-        <w:t>Deterministic seeding across random, numpy, torch, CUDA and cuDNN</w:t>
-      </w:r>
-    </w:p>
-    <w:p>
-      <w:pPr>
-        <w:pStyle w:val="ListBullet"/>
-      </w:pPr>
-      <w:r>
-        <w:t>Positional encoding actually applied in the transformer</w:t>
+        <w:t>- Positional encoding actually applied in the transformer</w:t>
       </w:r>
     </w:p>
     <w:sectPr>
@@ -1035,6 +628,10 @@
     <w:name w:val="Normal"/>
     <w:qFormat/>
     <w:rsid w:val="00FC693F"/>
+    <w:rPr>
+      <w:rFonts w:ascii="Consolas" w:hAnsi="Consolas"/>
+      <w:sz w:val="20"/>
+    </w:rPr>
   </w:style>
   <w:style w:type="paragraph" w:styleId="Header">
     <w:name w:val="header"/>

</xml_diff>

<commit_message>
Revert what_changed_txt.docx to the formatted version
Co-Authored-By: Claude Sonnet 5 <noreply@anthropic.com>
</commit_message>
<xml_diff>
--- a/document/what_changed_txt.docx
+++ b/document/what_changed_txt.docx
@@ -3,256 +3,663 @@
 <w:document xmlns:wpc="http://schemas.microsoft.com/office/word/2010/wordprocessingCanvas" xmlns:mo="http://schemas.microsoft.com/office/mac/office/2008/main" xmlns:mc="http://schemas.openxmlformats.org/markup-compatibility/2006" xmlns:mv="urn:schemas-microsoft-com:mac:vml" xmlns:o="urn:schemas-microsoft-com:office:office" xmlns:r="http://schemas.openxmlformats.org/officeDocument/2006/relationships" xmlns:m="http://schemas.openxmlformats.org/officeDocument/2006/math" xmlns:v="urn:schemas-microsoft-com:vml" xmlns:wp14="http://schemas.microsoft.com/office/word/2010/wordprocessingDrawing" xmlns:wp="http://schemas.openxmlformats.org/drawingml/2006/wordprocessingDrawing" xmlns:w10="urn:schemas-microsoft-com:office:word" xmlns:w="http://schemas.openxmlformats.org/wordprocessingml/2006/main" xmlns:w14="http://schemas.microsoft.com/office/word/2010/wordml" xmlns:wpg="http://schemas.microsoft.com/office/word/2010/wordprocessingGroup" xmlns:wpi="http://schemas.microsoft.com/office/word/2010/wordprocessingInk" xmlns:wne="http://schemas.microsoft.com/office/word/2006/wordml" xmlns:wps="http://schemas.microsoft.com/office/word/2010/wordprocessingShape" mc:Ignorable="w14 wp14">
   <w:body>
     <w:p>
+      <w:pPr>
+        <w:pStyle w:val="Heading1"/>
+      </w:pPr>
       <w:r>
-        <w:t>## What changed</w:t>
+        <w:t>What changed</w:t>
       </w:r>
     </w:p>
-    <w:p/>
     <w:p>
       <w:r>
         <w:t>Every claim below was verified by running the code, not by reading it.</w:t>
       </w:r>
     </w:p>
-    <w:p/>
     <w:p>
+      <w:pPr>
+        <w:pStyle w:val="Heading2"/>
+      </w:pPr>
       <w:r>
-        <w:t>### Dependency graph</w:t>
+        <w:t>Dependency graph</w:t>
       </w:r>
     </w:p>
-    <w:p/>
     <w:p>
       <w:r>
         <w:t>Before, importing any BatteryML trainer pulled in the entire MIT pipeline:</w:t>
       </w:r>
     </w:p>
-    <w:p/>
     <w:p>
+      <w:pPr>
+        <w:spacing w:before="120" w:after="240"/>
+      </w:pPr>
       <w:r>
+        <w:rPr>
+          <w:rFonts w:ascii="Consolas" w:hAnsi="Consolas"/>
+          <w:sz w:val="18"/>
+        </w:rPr>
         <w:t>train_clf_bml -&gt; train_clf -&gt; dataset_clf -&gt; gen_features -&gt; h5py</w:t>
       </w:r>
     </w:p>
-    <w:p/>
     <w:p>
       <w:r>
         <w:t>train_clf.py mixed two jobs in one file: the shared model definitions (lines 29-170) and its own MIT-dataset CLI. Python cannot import half a file, so borrowing the model meant loading the dataset layer of a corpus you were not using. The shared half is now model_clf.py, which imports nothing but torch and numpy.</w:t>
       </w:r>
     </w:p>
-    <w:p/>
     <w:p>
+      <w:pPr>
+        <w:spacing w:before="120" w:after="240"/>
+      </w:pPr>
       <w:r>
+        <w:rPr>
+          <w:rFonts w:ascii="Consolas" w:hAnsi="Consolas"/>
+          <w:sz w:val="18"/>
+        </w:rPr>
         <w:t>train_clf_bml_V2      -&gt; model_clf, dataset_clf_bml_v2   (no MIT modules)</w:t>
       </w:r>
-    </w:p>
-    <w:p>
       <w:r>
+        <w:br/>
+      </w:r>
+      <w:r>
+        <w:rPr>
+          <w:rFonts w:ascii="Consolas" w:hAnsi="Consolas"/>
+          <w:sz w:val="18"/>
+        </w:rPr>
         <w:t>train_clf_es_bml_V2   -&gt; model_clf, dataset_clf_bml_v2</w:t>
       </w:r>
-    </w:p>
-    <w:p>
       <w:r>
+        <w:br/>
+      </w:r>
+      <w:r>
+        <w:rPr>
+          <w:rFonts w:ascii="Consolas" w:hAnsi="Consolas"/>
+          <w:sz w:val="18"/>
+        </w:rPr>
         <w:t>train_clf_bml_tf_V2   -&gt; dataset_clf_bml_v2              (model inlined)</w:t>
       </w:r>
-    </w:p>
-    <w:p>
       <w:r>
+        <w:br/>
+      </w:r>
+      <w:r>
+        <w:rPr>
+          <w:rFonts w:ascii="Consolas" w:hAnsi="Consolas"/>
+          <w:sz w:val="18"/>
+        </w:rPr>
         <w:t>dataset_clf_bml_v2    -&gt; gen_feature_bml_v2</w:t>
       </w:r>
-    </w:p>
-    <w:p>
       <w:r>
+        <w:br/>
+      </w:r>
+      <w:r>
+        <w:rPr>
+          <w:rFonts w:ascii="Consolas" w:hAnsi="Consolas"/>
+          <w:sz w:val="18"/>
+        </w:rPr>
         <w:t>model_clf             -&gt; (nothing)</w:t>
       </w:r>
     </w:p>
-    <w:p/>
     <w:p>
       <w:r>
         <w:t>Repository went from 20 files to 7.</w:t>
       </w:r>
     </w:p>
-    <w:p/>
     <w:p>
+      <w:pPr>
+        <w:pStyle w:val="Heading2"/>
+      </w:pPr>
       <w:r>
-        <w:t>### Bugs fixed</w:t>
+        <w:t>Bugs fixed</w:t>
       </w:r>
     </w:p>
-    <w:p/>
     <w:p>
+      <w:pPr>
+        <w:spacing w:before="200" w:after="80"/>
+      </w:pPr>
       <w:r>
+        <w:rPr>
+          <w:b/>
+        </w:rPr>
         <w:t>Feature export / dataset</w:t>
       </w:r>
     </w:p>
+    <w:tbl>
+      <w:tblPr>
+        <w:tblStyle w:val="LightGrid-Accent1"/>
+        <w:tblW w:type="auto" w:w="0"/>
+        <w:tblLook w:firstColumn="1" w:firstRow="1" w:lastColumn="0" w:lastRow="0" w:noHBand="0" w:noVBand="1" w:val="04A0"/>
+      </w:tblPr>
+      <w:tblGrid>
+        <w:gridCol w:w="4320"/>
+        <w:gridCol w:w="4320"/>
+      </w:tblGrid>
+      <w:tr>
+        <w:tc>
+          <w:tcPr>
+            <w:tcW w:type="dxa" w:w="4320"/>
+          </w:tcPr>
+          <w:p>
+            <w:r>
+              <w:rPr>
+                <w:b/>
+              </w:rPr>
+              <w:t>Bug</w:t>
+            </w:r>
+          </w:p>
+        </w:tc>
+        <w:tc>
+          <w:tcPr>
+            <w:tcW w:type="dxa" w:w="4320"/>
+          </w:tcPr>
+          <w:p>
+            <w:r>
+              <w:rPr>
+                <w:b/>
+              </w:rPr>
+              <w:t>Effect</w:t>
+            </w:r>
+          </w:p>
+        </w:tc>
+      </w:tr>
+      <w:tr>
+        <w:tc>
+          <w:tcPr>
+            <w:tcW w:type="dxa" w:w="4320"/>
+          </w:tcPr>
+          <w:p>
+            <w:r>
+              <w:t>"Qc": qd — charge capacity keyed to the discharge array</w:t>
+            </w:r>
+          </w:p>
+        </w:tc>
+        <w:tc>
+          <w:tcPr>
+            <w:tcW w:type="dxa" w:w="4320"/>
+          </w:tcPr>
+          <w:p>
+            <w:r>
+              <w:t>Silent duplicate of Qd the moment Qc is enabled</w:t>
+            </w:r>
+          </w:p>
+        </w:tc>
+      </w:tr>
+      <w:tr>
+        <w:tc>
+          <w:tcPr>
+            <w:tcW w:type="dxa" w:w="4320"/>
+          </w:tcPr>
+          <w:p>
+            <w:r>
+              <w:t>Loader re-ran its own EOL search over already-truncated arrays</w:t>
+            </w:r>
+          </w:p>
+        </w:tc>
+        <w:tc>
+          <w:tcPr>
+            <w:tcW w:type="dxa" w:w="4320"/>
+          </w:tcPr>
+          <w:p>
+            <w:r>
+              <w:t>Undid the exporter's confirmation-window rule on 4/169 MATR cells, one by up to 113 cycles</w:t>
+            </w:r>
+          </w:p>
+        </w:tc>
+      </w:tr>
+      <w:tr>
+        <w:tc>
+          <w:tcPr>
+            <w:tcW w:type="dxa" w:w="4320"/>
+          </w:tcPr>
+          <w:p>
+            <w:r>
+              <w:t>Missing .npz key returned an empty array</w:t>
+            </w:r>
+          </w:p>
+        </w:tc>
+        <w:tc>
+          <w:tcPr>
+            <w:tcW w:type="dxa" w:w="4320"/>
+          </w:tcPr>
+          <w:p>
+            <w:r>
+              <w:t>Feature column became a constant zero; training ran, accuracy silently dropped</w:t>
+            </w:r>
+          </w:p>
+        </w:tc>
+      </w:tr>
+      <w:tr>
+        <w:tc>
+          <w:tcPr>
+            <w:tcW w:type="dxa" w:w="4320"/>
+          </w:tcPr>
+          <w:p>
+            <w:r>
+              <w:t>dqdv loaded but never read</w:t>
+            </w:r>
+          </w:p>
+        </w:tc>
+        <w:tc>
+          <w:tcPr>
+            <w:tcW w:type="dxa" w:w="4320"/>
+          </w:tcPr>
+          <w:p>
+            <w:r>
+              <w:t>194 MB of resident memory across 64 cells</w:t>
+            </w:r>
+          </w:p>
+        </w:tc>
+      </w:tr>
+      <w:tr>
+        <w:tc>
+          <w:tcPr>
+            <w:tcW w:type="dxa" w:w="4320"/>
+          </w:tcPr>
+          <w:p>
+            <w:r>
+              <w:t>Scaler fitted on one concatenated block</w:t>
+            </w:r>
+          </w:p>
+        </w:tc>
+        <w:tc>
+          <w:tcPr>
+            <w:tcW w:type="dxa" w:w="4320"/>
+          </w:tcPr>
+          <w:p>
+            <w:r>
+              <w:t>2.56 GB peak; partial_fit in chunks peaks at 32 MB with bit-identical transform output</w:t>
+            </w:r>
+          </w:p>
+        </w:tc>
+      </w:tr>
+    </w:tbl>
     <w:p/>
     <w:p>
+      <w:pPr>
+        <w:spacing w:before="200" w:after="80"/>
+      </w:pPr>
       <w:r>
-        <w:t>| Bug | Effect |</w:t>
+        <w:rPr>
+          <w:b/>
+        </w:rPr>
+        <w:t>Sparse CMA-ES trainer</w:t>
+      </w:r>
+    </w:p>
+    <w:tbl>
+      <w:tblPr>
+        <w:tblStyle w:val="LightGrid-Accent1"/>
+        <w:tblW w:type="auto" w:w="0"/>
+        <w:tblLook w:firstColumn="1" w:firstRow="1" w:lastColumn="0" w:lastRow="0" w:noHBand="0" w:noVBand="1" w:val="04A0"/>
+      </w:tblPr>
+      <w:tblGrid>
+        <w:gridCol w:w="4320"/>
+        <w:gridCol w:w="4320"/>
+      </w:tblGrid>
+      <w:tr>
+        <w:tc>
+          <w:tcPr>
+            <w:tcW w:type="dxa" w:w="4320"/>
+          </w:tcPr>
+          <w:p>
+            <w:r>
+              <w:rPr>
+                <w:b/>
+              </w:rPr>
+              <w:t>Bug</w:t>
+            </w:r>
+          </w:p>
+        </w:tc>
+        <w:tc>
+          <w:tcPr>
+            <w:tcW w:type="dxa" w:w="4320"/>
+          </w:tcPr>
+          <w:p>
+            <w:r>
+              <w:rPr>
+                <w:b/>
+              </w:rPr>
+              <w:t>Effect</w:t>
+            </w:r>
+          </w:p>
+        </w:tc>
+      </w:tr>
+      <w:tr>
+        <w:tc>
+          <w:tcPr>
+            <w:tcW w:type="dxa" w:w="4320"/>
+          </w:tcPr>
+          <w:p>
+            <w:r>
+              <w:t>mask = abs(w) &lt;= threshold under a comment reading keep LARGE weights</w:t>
+            </w:r>
+          </w:p>
+        </w:tc>
+        <w:tc>
+          <w:tcPr>
+            <w:tcW w:type="dxa" w:w="4320"/>
+          </w:tcPr>
+          <w:p>
+            <w:r>
+              <w:t>Evolved the smallest weights — the exact opposite of the design</w:t>
+            </w:r>
+          </w:p>
+        </w:tc>
+      </w:tr>
+      <w:tr>
+        <w:tc>
+          <w:tcPr>
+            <w:tcW w:type="dxa" w:w="4320"/>
+          </w:tcPr>
+          <w:p>
+            <w:r>
+              <w:t>_ES_MODULES listed all five submodules</w:t>
+            </w:r>
+          </w:p>
+        </w:tc>
+        <w:tc>
+          <w:tcPr>
+            <w:tcW w:type="dxa" w:w="4320"/>
+          </w:tcPr>
+          <w:p>
+            <w:r>
+              <w:t>34/34 parameter tensors were maskable, so nothing was frozen despite the docstring</w:t>
+            </w:r>
+          </w:p>
+        </w:tc>
+      </w:tr>
+      <w:tr>
+        <w:tc>
+          <w:tcPr>
+            <w:tcW w:type="dxa" w:w="4320"/>
+          </w:tcPr>
+          <w:p>
+            <w:r>
+              <w:t>train_loader=val_loader, val_loader=train_loader at the call site</w:t>
+            </w:r>
+          </w:p>
+        </w:tc>
+        <w:tc>
+          <w:tcPr>
+            <w:tcW w:type="dxa" w:w="4320"/>
+          </w:tcPr>
+          <w:p>
+            <w:r>
+              <w:t>Fitness was measured on the training split</w:t>
+            </w:r>
+          </w:p>
+        </w:tc>
+      </w:tr>
+      <w:tr>
+        <w:tc>
+          <w:tcPr>
+            <w:tcW w:type="dxa" w:w="4320"/>
+          </w:tcPr>
+          <w:p>
+            <w:r>
+              <w:t>cnn_dim reconstructed as head[0].in_features // 2</w:t>
+            </w:r>
+          </w:p>
+        </w:tc>
+        <w:tc>
+          <w:tcPr>
+            <w:tcW w:type="dxa" w:w="4320"/>
+          </w:tcPr>
+          <w:p>
+            <w:r>
+              <w:t>Equals gru_dim, not cnn_dim; every worker crashed once the two differed</w:t>
+            </w:r>
+          </w:p>
+        </w:tc>
+      </w:tr>
+      <w:tr>
+        <w:tc>
+          <w:tcPr>
+            <w:tcW w:type="dxa" w:w="4320"/>
+          </w:tcPr>
+          <w:p>
+            <w:r>
+              <w:t>except Exception: put((rank, 0.0)) with no logging</w:t>
+            </w:r>
+          </w:p>
+        </w:tc>
+        <w:tc>
+          <w:tcPr>
+            <w:tcW w:type="dxa" w:w="4320"/>
+          </w:tcPr>
+          <w:p>
+            <w:r>
+              <w:t>Worker crashes were indistinguishable from genuinely bad offspring</w:t>
+            </w:r>
+          </w:p>
+        </w:tc>
+      </w:tr>
+      <w:tr>
+        <w:tc>
+          <w:tcPr>
+            <w:tcW w:type="dxa" w:w="4320"/>
+          </w:tcPr>
+          <w:p>
+            <w:r>
+              <w:t>best_acc assigned once before the loop, then returned</w:t>
+            </w:r>
+          </w:p>
+        </w:tc>
+        <w:tc>
+          <w:tcPr>
+            <w:tcW w:type="dxa" w:w="4320"/>
+          </w:tcPr>
+          <w:p>
+            <w:r>
+              <w:t>Early-stop gate and return value both frozen at the pre-search value</w:t>
+            </w:r>
+          </w:p>
+        </w:tc>
+      </w:tr>
+    </w:tbl>
+    <w:p/>
+    <w:p>
+      <w:pPr>
+        <w:spacing w:before="200" w:after="80"/>
+      </w:pPr>
+      <w:r>
+        <w:rPr>
+          <w:b/>
+        </w:rPr>
+        <w:t>Transformer trainer</w:t>
+      </w:r>
+    </w:p>
+    <w:tbl>
+      <w:tblPr>
+        <w:tblStyle w:val="LightGrid-Accent1"/>
+        <w:tblW w:type="auto" w:w="0"/>
+        <w:tblLook w:firstColumn="1" w:firstRow="1" w:lastColumn="0" w:lastRow="0" w:noHBand="0" w:noVBand="1" w:val="04A0"/>
+      </w:tblPr>
+      <w:tblGrid>
+        <w:gridCol w:w="4320"/>
+        <w:gridCol w:w="4320"/>
+      </w:tblGrid>
+      <w:tr>
+        <w:tc>
+          <w:tcPr>
+            <w:tcW w:type="dxa" w:w="4320"/>
+          </w:tcPr>
+          <w:p>
+            <w:r>
+              <w:rPr>
+                <w:b/>
+              </w:rPr>
+              <w:t>Bug</w:t>
+            </w:r>
+          </w:p>
+        </w:tc>
+        <w:tc>
+          <w:tcPr>
+            <w:tcW w:type="dxa" w:w="4320"/>
+          </w:tcPr>
+          <w:p>
+            <w:r>
+              <w:rPr>
+                <w:b/>
+              </w:rPr>
+              <w:t>Effect</w:t>
+            </w:r>
+          </w:p>
+        </w:tc>
+      </w:tr>
+      <w:tr>
+        <w:tc>
+          <w:tcPr>
+            <w:tcW w:type="dxa" w:w="4320"/>
+          </w:tcPr>
+          <w:p>
+            <w:r>
+              <w:t>_build_pos_enc defined, never called in forward</w:t>
+            </w:r>
+          </w:p>
+        </w:tc>
+        <w:tc>
+          <w:tcPr>
+            <w:tcW w:type="dxa" w:w="4320"/>
+          </w:tcPr>
+          <w:p>
+            <w:r>
+              <w:t>f(x) and f(reversed x) matched to 0.000000 — the window was an unordered bag</w:t>
+            </w:r>
+          </w:p>
+        </w:tc>
+      </w:tr>
+      <w:tr>
+        <w:tc>
+          <w:tcPr>
+            <w:tcW w:type="dxa" w:w="4320"/>
+          </w:tcPr>
+          <w:p>
+            <w:r>
+              <w:t>classification_report without labels=</w:t>
+            </w:r>
+          </w:p>
+        </w:tc>
+        <w:tc>
+          <w:tcPr>
+            <w:tcW w:type="dxa" w:w="4320"/>
+          </w:tcPr>
+          <w:p>
+            <w:r>
+              <w:t>ValueError whenever the test split lacked a class</w:t>
+            </w:r>
+          </w:p>
+        </w:tc>
+      </w:tr>
+      <w:tr>
+        <w:tc>
+          <w:tcPr>
+            <w:tcW w:type="dxa" w:w="4320"/>
+          </w:tcPr>
+          <w:p>
+            <w:r>
+              <w:t>No seeding anywhere</w:t>
+            </w:r>
+          </w:p>
+        </w:tc>
+        <w:tc>
+          <w:tcPr>
+            <w:tcW w:type="dxa" w:w="4320"/>
+          </w:tcPr>
+          <w:p>
+            <w:r>
+              <w:t>Two runs of the same command produced different models</w:t>
+            </w:r>
+          </w:p>
+        </w:tc>
+      </w:tr>
+    </w:tbl>
+    <w:p/>
+    <w:p>
+      <w:pPr>
+        <w:spacing w:before="200" w:after="80"/>
+      </w:pPr>
+      <w:r>
+        <w:rPr>
+          <w:b/>
+        </w:rPr>
+        <w:t>Shared across trainers</w:t>
       </w:r>
     </w:p>
     <w:p>
+      <w:pPr>
+        <w:pStyle w:val="ListBullet"/>
+      </w:pPr>
       <w:r>
-        <w:t>|---|---|</w:t>
+        <w:t>ReduceLROnPlateau(verbose=True) — removed from PyTorch; the trainer crashed before the first epoch</w:t>
       </w:r>
     </w:p>
     <w:p>
+      <w:pPr>
+        <w:pStyle w:val="ListBullet"/>
+      </w:pPr>
       <w:r>
-        <w:t>| "Qc": qd - charge capacity keyed to the discharge array | Silent duplicate of Qd the moment Qc is enabled |</w:t>
+        <w:t>import cma at module level — blocked --es_mode 0, which uses no CMA-ES</w:t>
       </w:r>
     </w:p>
     <w:p>
+      <w:pPr>
+        <w:pStyle w:val="ListBullet"/>
+      </w:pPr>
       <w:r>
-        <w:t>| Loader re-ran its own EOL search over already-truncated arrays | Undid the exporter's confirmation-window rule on 4/169 MATR cells, one by up to 113 cycles |</w:t>
+        <w:t>torch.manual_seed without cudnn.deterministic — VaLoss still drifted (0.8858 / 0.8850 / 0.8846); pinning cuDNN makes runs match digit for digit</w:t>
       </w:r>
     </w:p>
     <w:p>
+      <w:pPr>
+        <w:pStyle w:val="ListBullet"/>
+      </w:pPr>
       <w:r>
-        <w:t>| Missing .npz key returned an empty array | Feature column became a constant zero; training ran, accuracy silently dropped |</w:t>
+        <w:t>va_acc &gt;= best_val_acc — re-saved the checkpoint on ties, so stagnation never accumulated</w:t>
       </w:r>
     </w:p>
     <w:p>
+      <w:pPr>
+        <w:pStyle w:val="ListBullet"/>
+      </w:pPr>
       <w:r>
-        <w:t>| dqdv loaded but never read | 194 MB of resident memory across 64 cells |</w:t>
+        <w:t>CMA-ES branch left the model holding parameters that scored worse than the checkpoint on disk</w:t>
       </w:r>
     </w:p>
     <w:p>
+      <w:pPr>
+        <w:pStyle w:val="Heading2"/>
+      </w:pPr>
       <w:r>
-        <w:t>| Scaler fitted on one concatenated block | 2.56 GB peak; partial_fit in chunks peaks at 32 MB with bit-identical transform output |</w:t>
-      </w:r>
-    </w:p>
-    <w:p/>
-    <w:p>
-      <w:r>
-        <w:t>Sparse CMA-ES trainer</w:t>
-      </w:r>
-    </w:p>
-    <w:p/>
-    <w:p>
-      <w:r>
-        <w:t>| Bug | Effect |</w:t>
+        <w:t>Added</w:t>
       </w:r>
     </w:p>
     <w:p>
+      <w:pPr>
+        <w:pStyle w:val="ListBullet"/>
+      </w:pPr>
       <w:r>
-        <w:t>|---|---|</w:t>
+        <w:t>model_config.json beside every checkpoint, so the notebook rebuilds the architecture instead of retyping it</w:t>
       </w:r>
     </w:p>
     <w:p>
+      <w:pPr>
+        <w:pStyle w:val="ListBullet"/>
+      </w:pPr>
       <w:r>
-        <w:t>| mask = abs(w) &lt;= threshold under a comment reading keep LARGE weights | Evolved the smallest weights - the exact opposite of the design |</w:t>
+        <w:t>Info_log.txt mirroring console output (verified byte-identical)</w:t>
       </w:r>
     </w:p>
     <w:p>
+      <w:pPr>
+        <w:pStyle w:val="ListBullet"/>
+      </w:pPr>
       <w:r>
-        <w:t>| _ES_MODULES listed all five submodules | 34/34 parameter tensors were maskable, so nothing was frozen despite the docstring |</w:t>
+        <w:t>Deterministic seeding across random, numpy, torch, CUDA and cuDNN</w:t>
       </w:r>
     </w:p>
     <w:p>
+      <w:pPr>
+        <w:pStyle w:val="ListBullet"/>
+      </w:pPr>
       <w:r>
-        <w:t>| train_loader=val_loader, val_loader=train_loader at the call site | Fitness was measured on the training split |</w:t>
-      </w:r>
-    </w:p>
-    <w:p>
-      <w:r>
-        <w:t>| cnn_dim reconstructed as head[0].in_features // 2 | Equals gru_dim, not cnn_dim; every worker crashed once the two differed |</w:t>
-      </w:r>
-    </w:p>
-    <w:p>
-      <w:r>
-        <w:t>| except Exception: put((rank, 0.0)) with no logging | Worker crashes were indistinguishable from genuinely bad offspring |</w:t>
-      </w:r>
-    </w:p>
-    <w:p>
-      <w:r>
-        <w:t>| best_acc assigned once before the loop, then returned | Early-stop gate and return value both frozen at the pre-search value |</w:t>
-      </w:r>
-    </w:p>
-    <w:p/>
-    <w:p>
-      <w:r>
-        <w:t>Transformer trainer</w:t>
-      </w:r>
-    </w:p>
-    <w:p/>
-    <w:p>
-      <w:r>
-        <w:t>| Bug | Effect |</w:t>
-      </w:r>
-    </w:p>
-    <w:p>
-      <w:r>
-        <w:t>|---|---|</w:t>
-      </w:r>
-    </w:p>
-    <w:p>
-      <w:r>
-        <w:t>| _build_pos_enc defined, never called in forward | f(x) and f(reversed x) matched to 0.000000 - the window was an unordered bag |</w:t>
-      </w:r>
-    </w:p>
-    <w:p>
-      <w:r>
-        <w:t>| classification_report without labels= | ValueError whenever the test split lacked a class |</w:t>
-      </w:r>
-    </w:p>
-    <w:p>
-      <w:r>
-        <w:t>| No seeding anywhere | Two runs of the same command produced different models |</w:t>
-      </w:r>
-    </w:p>
-    <w:p/>
-    <w:p>
-      <w:r>
-        <w:t>Shared across trainers</w:t>
-      </w:r>
-    </w:p>
-    <w:p/>
-    <w:p>
-      <w:r>
-        <w:t>- ReduceLROnPlateau(verbose=True) - removed from PyTorch; the trainer crashed before the first epoch</w:t>
-      </w:r>
-    </w:p>
-    <w:p>
-      <w:r>
-        <w:t>- import cma at module level - blocked --es_mode 0, which uses no CMA-ES</w:t>
-      </w:r>
-    </w:p>
-    <w:p>
-      <w:r>
-        <w:t>- torch.manual_seed without cudnn.deterministic - VaLoss still drifted (0.8858 / 0.8850 / 0.8846); pinning cuDNN makes runs match digit for digit</w:t>
-      </w:r>
-    </w:p>
-    <w:p>
-      <w:r>
-        <w:t>- va_acc &gt;= best_val_acc - re-saved the checkpoint on ties, so stagnation never accumulated</w:t>
-      </w:r>
-    </w:p>
-    <w:p>
-      <w:r>
-        <w:t>- CMA-ES branch left the model holding parameters that scored worse than the checkpoint on disk</w:t>
-      </w:r>
-    </w:p>
-    <w:p/>
-    <w:p>
-      <w:r>
-        <w:t>### Added</w:t>
-      </w:r>
-    </w:p>
-    <w:p/>
-    <w:p>
-      <w:r>
-        <w:t>- model_config.json beside every checkpoint, so the notebook rebuilds the architecture instead of retyping it</w:t>
-      </w:r>
-    </w:p>
-    <w:p>
-      <w:r>
-        <w:t>- Info_log.txt mirroring console output (verified byte-identical)</w:t>
-      </w:r>
-    </w:p>
-    <w:p>
-      <w:r>
-        <w:t>- Deterministic seeding across random, numpy, torch, CUDA and cuDNN</w:t>
-      </w:r>
-    </w:p>
-    <w:p>
-      <w:r>
-        <w:t>- Positional encoding actually applied in the transformer</w:t>
+        <w:t>Positional encoding actually applied in the transformer</w:t>
       </w:r>
     </w:p>
     <w:sectPr>
@@ -628,10 +1035,6 @@
     <w:name w:val="Normal"/>
     <w:qFormat/>
     <w:rsid w:val="00FC693F"/>
-    <w:rPr>
-      <w:rFonts w:ascii="Consolas" w:hAnsi="Consolas"/>
-      <w:sz w:val="20"/>
-    </w:rPr>
   </w:style>
   <w:style w:type="paragraph" w:styleId="Header">
     <w:name w:val="header"/>

</xml_diff>